<commit_message>
update keywords feature + report template
</commit_message>
<xml_diff>
--- a/backend/utility/template/template_eforensics_analysis_report.docx
+++ b/backend/utility/template/template_eforensics_analysis_report.docx
@@ -22,6 +22,19 @@
     </w:p>
     <w:p>
       <w:pPr>
+        <w:sectPr>
+          <w:footerReference w:type="even" r:id="rId2"/>
+          <w:footerReference w:type="default" r:id="rId3"/>
+          <w:footerReference w:type="first" r:id="rId4"/>
+          <w:type w:val="nextPage"/>
+          <w:pgSz w:w="11906" w:h="16838"/>
+          <w:pgMar w:left="1440" w:right="1440" w:gutter="0" w:header="0" w:top="1440" w:footer="709" w:bottom="1440"/>
+          <w:pgNumType w:fmt="decimal"/>
+          <w:formProt w:val="false"/>
+          <w:vAlign w:val="center"/>
+          <w:textDirection w:val="lrTb"/>
+          <w:docGrid w:type="default" w:linePitch="100" w:charSpace="0"/>
+        </w:sectPr>
         <w:pStyle w:val="Normal"/>
         <w:spacing w:lineRule="auto" w:line="240" w:before="0" w:after="0"/>
         <w:jc w:val="center"/>
@@ -37,22 +50,6 @@
         </w:rPr>
         <w:t>{{investigated_device}}</w:t>
       </w:r>
-    </w:p>
-    <w:p>
-      <w:pPr>
-        <w:sectPr>
-          <w:footerReference w:type="even" r:id="rId2"/>
-          <w:footerReference w:type="default" r:id="rId3"/>
-          <w:footerReference w:type="first" r:id="rId4"/>
-          <w:type w:val="nextPage"/>
-          <w:pgSz w:w="11906" w:h="16838"/>
-          <w:pgMar w:left="1440" w:right="1440" w:gutter="0" w:header="0" w:top="1440" w:footer="709" w:bottom="1440"/>
-          <w:pgNumType w:fmt="decimal"/>
-          <w:formProt w:val="false"/>
-          <w:vAlign w:val="center"/>
-          <w:textDirection w:val="lrTb"/>
-        </w:sectPr>
-      </w:pPr>
     </w:p>
     <w:p>
       <w:pPr>
@@ -104,6 +101,7 @@
             <w:rPr>
               <w:webHidden/>
               <w:rStyle w:val="IndexLink"/>
+              <w:vanish w:val="false"/>
             </w:rPr>
             <w:instrText xml:space="preserve"> TOC \z \o "1-3" \u \h</w:instrText>
           </w:r>
@@ -111,6 +109,7 @@
             <w:rPr>
               <w:webHidden/>
               <w:rStyle w:val="IndexLink"/>
+              <w:vanish w:val="false"/>
             </w:rPr>
             <w:fldChar w:fldCharType="separate"/>
           </w:r>
@@ -119,6 +118,7 @@
               <w:rPr>
                 <w:webHidden/>
                 <w:rStyle w:val="IndexLink"/>
+                <w:vanish w:val="false"/>
               </w:rPr>
               <w:t>1.</w:t>
             </w:r>
@@ -190,6 +190,7 @@
               <w:rPr>
                 <w:webHidden/>
                 <w:rStyle w:val="IndexLink"/>
+                <w:vanish w:val="false"/>
               </w:rPr>
               <w:t>2.</w:t>
             </w:r>
@@ -261,6 +262,7 @@
               <w:rPr>
                 <w:webHidden/>
                 <w:rStyle w:val="IndexLink"/>
+                <w:vanish w:val="false"/>
               </w:rPr>
               <w:t>3.</w:t>
             </w:r>
@@ -332,6 +334,7 @@
               <w:rPr>
                 <w:webHidden/>
                 <w:rStyle w:val="IndexLink"/>
+                <w:vanish w:val="false"/>
               </w:rPr>
               <w:t>4.</w:t>
             </w:r>
@@ -403,6 +406,7 @@
               <w:rPr>
                 <w:webHidden/>
                 <w:rStyle w:val="IndexLink"/>
+                <w:vanish w:val="false"/>
               </w:rPr>
               <w:t>5.</w:t>
             </w:r>
@@ -474,6 +478,7 @@
               <w:rPr>
                 <w:webHidden/>
                 <w:rStyle w:val="IndexLink"/>
+                <w:vanish w:val="false"/>
               </w:rPr>
               <w:t>6.</w:t>
             </w:r>
@@ -535,16 +540,6 @@
         </w:p>
       </w:sdtContent>
     </w:sdt>
-    <w:p>
-      <w:pPr>
-        <w:pStyle w:val="Normal"/>
-        <w:spacing w:lineRule="auto" w:line="240" w:before="0" w:after="0"/>
-        <w:rPr/>
-      </w:pPr>
-      <w:r>
-        <w:rPr/>
-      </w:r>
-    </w:p>
     <w:p>
       <w:pPr>
         <w:pStyle w:val="Normal"/>
@@ -641,8 +636,8 @@
         <w:gridCol w:w="862"/>
         <w:gridCol w:w="1130"/>
         <w:gridCol w:w="1284"/>
-        <w:gridCol w:w="1231"/>
-        <w:gridCol w:w="964"/>
+        <w:gridCol w:w="1232"/>
+        <w:gridCol w:w="963"/>
         <w:gridCol w:w="861"/>
       </w:tblGrid>
       <w:tr>
@@ -656,6 +651,7 @@
             <w:pPr>
               <w:pStyle w:val="Normal"/>
               <w:widowControl/>
+              <w:suppressAutoHyphens w:val="true"/>
               <w:spacing w:lineRule="auto" w:line="240" w:before="0" w:after="0"/>
               <w:jc w:val="center"/>
               <w:rPr>
@@ -686,6 +682,7 @@
             <w:pPr>
               <w:pStyle w:val="Normal"/>
               <w:widowControl/>
+              <w:suppressAutoHyphens w:val="true"/>
               <w:spacing w:lineRule="auto" w:line="240" w:before="0" w:after="0"/>
               <w:jc w:val="center"/>
               <w:rPr>
@@ -716,6 +713,7 @@
             <w:pPr>
               <w:pStyle w:val="Normal"/>
               <w:widowControl/>
+              <w:suppressAutoHyphens w:val="true"/>
               <w:spacing w:lineRule="auto" w:line="240" w:before="0" w:after="0"/>
               <w:jc w:val="center"/>
               <w:rPr>
@@ -746,6 +744,7 @@
             <w:pPr>
               <w:pStyle w:val="Normal"/>
               <w:widowControl/>
+              <w:suppressAutoHyphens w:val="true"/>
               <w:spacing w:lineRule="auto" w:line="240" w:before="0" w:after="0"/>
               <w:jc w:val="center"/>
               <w:rPr>
@@ -776,6 +775,7 @@
             <w:pPr>
               <w:pStyle w:val="Normal"/>
               <w:widowControl/>
+              <w:suppressAutoHyphens w:val="true"/>
               <w:spacing w:lineRule="auto" w:line="240" w:before="0" w:after="0"/>
               <w:jc w:val="center"/>
               <w:rPr>
@@ -806,6 +806,7 @@
             <w:pPr>
               <w:pStyle w:val="Normal"/>
               <w:widowControl/>
+              <w:suppressAutoHyphens w:val="true"/>
               <w:spacing w:lineRule="auto" w:line="240" w:before="0" w:after="0"/>
               <w:jc w:val="center"/>
               <w:rPr>
@@ -829,13 +830,14 @@
         </w:tc>
         <w:tc>
           <w:tcPr>
-            <w:tcW w:w="1231" w:type="dxa"/>
-            <w:tcBorders/>
-          </w:tcPr>
-          <w:p>
-            <w:pPr>
-              <w:pStyle w:val="Normal"/>
-              <w:widowControl/>
+            <w:tcW w:w="1232" w:type="dxa"/>
+            <w:tcBorders/>
+          </w:tcPr>
+          <w:p>
+            <w:pPr>
+              <w:pStyle w:val="Normal"/>
+              <w:widowControl/>
+              <w:suppressAutoHyphens w:val="true"/>
               <w:spacing w:lineRule="auto" w:line="240" w:before="0" w:after="0"/>
               <w:jc w:val="center"/>
               <w:rPr>
@@ -859,13 +861,14 @@
         </w:tc>
         <w:tc>
           <w:tcPr>
-            <w:tcW w:w="964" w:type="dxa"/>
-            <w:tcBorders/>
-          </w:tcPr>
-          <w:p>
-            <w:pPr>
-              <w:pStyle w:val="Normal"/>
-              <w:widowControl/>
+            <w:tcW w:w="963" w:type="dxa"/>
+            <w:tcBorders/>
+          </w:tcPr>
+          <w:p>
+            <w:pPr>
+              <w:pStyle w:val="Normal"/>
+              <w:widowControl/>
+              <w:suppressAutoHyphens w:val="true"/>
               <w:spacing w:lineRule="auto" w:line="240" w:before="0" w:after="0"/>
               <w:jc w:val="center"/>
               <w:rPr>
@@ -896,6 +899,7 @@
             <w:pPr>
               <w:pStyle w:val="Normal"/>
               <w:widowControl/>
+              <w:suppressAutoHyphens w:val="true"/>
               <w:spacing w:lineRule="auto" w:line="240" w:before="0" w:after="0"/>
               <w:jc w:val="center"/>
               <w:rPr>
@@ -930,6 +934,7 @@
             <w:pPr>
               <w:pStyle w:val="Normal"/>
               <w:widowControl/>
+              <w:suppressAutoHyphens w:val="true"/>
               <w:spacing w:lineRule="auto" w:line="240" w:before="0" w:after="0"/>
               <w:jc w:val="left"/>
               <w:rPr>
@@ -948,27 +953,7 @@
                 <w:szCs w:val="22"/>
                 <w:lang w:val="en-AU" w:eastAsia="ja-JP" w:bidi="ar-SA"/>
               </w:rPr>
-              <w:t xml:space="preserve">{%tr for i in </w:t>
-            </w:r>
-            <w:r>
-              <w:rPr>
-                <w:rFonts w:eastAsia="游ゴシック" w:cs=""/>
-                <w:kern w:val="2"/>
-                <w:sz w:val="22"/>
-                <w:szCs w:val="22"/>
-                <w:lang w:val="en-AU" w:eastAsia="ja-JP" w:bidi="ar-SA"/>
-              </w:rPr>
-              <w:t>un</w:t>
-            </w:r>
-            <w:r>
-              <w:rPr>
-                <w:rFonts w:eastAsia="游ゴシック" w:cs=""/>
-                <w:kern w:val="2"/>
-                <w:sz w:val="22"/>
-                <w:szCs w:val="22"/>
-                <w:lang w:val="en-AU" w:eastAsia="ja-JP" w:bidi="ar-SA"/>
-              </w:rPr>
-              <w:t>deleted_files %}</w:t>
+              <w:t>{%tr for i in undeleted_files %}</w:t>
             </w:r>
           </w:p>
         </w:tc>
@@ -984,6 +969,7 @@
             <w:pPr>
               <w:pStyle w:val="Normal"/>
               <w:widowControl/>
+              <w:suppressAutoHyphens w:val="true"/>
               <w:spacing w:lineRule="auto" w:line="240" w:before="0" w:after="0"/>
               <w:jc w:val="left"/>
               <w:rPr>
@@ -1015,6 +1001,7 @@
             <w:pPr>
               <w:pStyle w:val="Normal"/>
               <w:widowControl/>
+              <w:suppressAutoHyphens w:val="true"/>
               <w:spacing w:lineRule="auto" w:line="240" w:before="0" w:after="0"/>
               <w:jc w:val="left"/>
               <w:rPr>
@@ -1046,6 +1033,7 @@
             <w:pPr>
               <w:pStyle w:val="Normal"/>
               <w:widowControl/>
+              <w:suppressAutoHyphens w:val="true"/>
               <w:spacing w:lineRule="auto" w:line="240" w:before="0" w:after="0"/>
               <w:jc w:val="left"/>
               <w:rPr>
@@ -1077,6 +1065,7 @@
             <w:pPr>
               <w:pStyle w:val="Normal"/>
               <w:widowControl/>
+              <w:suppressAutoHyphens w:val="true"/>
               <w:spacing w:lineRule="auto" w:line="240" w:before="0" w:after="0"/>
               <w:jc w:val="left"/>
               <w:rPr>
@@ -1108,6 +1097,7 @@
             <w:pPr>
               <w:pStyle w:val="Normal"/>
               <w:widowControl/>
+              <w:suppressAutoHyphens w:val="true"/>
               <w:spacing w:lineRule="auto" w:line="240" w:before="0" w:after="0"/>
               <w:jc w:val="left"/>
               <w:rPr>
@@ -1139,6 +1129,7 @@
             <w:pPr>
               <w:pStyle w:val="Normal"/>
               <w:widowControl/>
+              <w:suppressAutoHyphens w:val="true"/>
               <w:spacing w:lineRule="auto" w:line="240" w:before="0" w:after="0"/>
               <w:jc w:val="left"/>
               <w:rPr>
@@ -1163,13 +1154,14 @@
         </w:tc>
         <w:tc>
           <w:tcPr>
-            <w:tcW w:w="1231" w:type="dxa"/>
-            <w:tcBorders/>
-          </w:tcPr>
-          <w:p>
-            <w:pPr>
-              <w:pStyle w:val="Normal"/>
-              <w:widowControl/>
+            <w:tcW w:w="1232" w:type="dxa"/>
+            <w:tcBorders/>
+          </w:tcPr>
+          <w:p>
+            <w:pPr>
+              <w:pStyle w:val="Normal"/>
+              <w:widowControl/>
+              <w:suppressAutoHyphens w:val="true"/>
               <w:spacing w:lineRule="auto" w:line="240" w:before="0" w:after="0"/>
               <w:jc w:val="left"/>
               <w:rPr>
@@ -1194,13 +1186,14 @@
         </w:tc>
         <w:tc>
           <w:tcPr>
-            <w:tcW w:w="964" w:type="dxa"/>
-            <w:tcBorders/>
-          </w:tcPr>
-          <w:p>
-            <w:pPr>
-              <w:pStyle w:val="Normal"/>
-              <w:widowControl/>
+            <w:tcW w:w="963" w:type="dxa"/>
+            <w:tcBorders/>
+          </w:tcPr>
+          <w:p>
+            <w:pPr>
+              <w:pStyle w:val="Normal"/>
+              <w:widowControl/>
+              <w:suppressAutoHyphens w:val="true"/>
               <w:spacing w:lineRule="auto" w:line="240" w:before="0" w:after="0"/>
               <w:jc w:val="left"/>
               <w:rPr>
@@ -1232,6 +1225,7 @@
             <w:pPr>
               <w:pStyle w:val="Normal"/>
               <w:widowControl/>
+              <w:suppressAutoHyphens w:val="true"/>
               <w:spacing w:lineRule="auto" w:line="240" w:before="0" w:after="0"/>
               <w:jc w:val="left"/>
               <w:rPr>
@@ -1267,6 +1261,7 @@
             <w:pPr>
               <w:pStyle w:val="Normal"/>
               <w:widowControl/>
+              <w:suppressAutoHyphens w:val="true"/>
               <w:spacing w:lineRule="auto" w:line="240" w:before="0" w:after="0"/>
               <w:jc w:val="left"/>
               <w:rPr>
@@ -1376,28 +1371,29 @@
         <w:tblLook w:val="04a0" w:noHBand="0" w:noVBand="1" w:firstColumn="1" w:lastRow="0" w:lastColumn="0" w:firstRow="1"/>
       </w:tblPr>
       <w:tblGrid>
-        <w:gridCol w:w="616"/>
-        <w:gridCol w:w="840"/>
+        <w:gridCol w:w="615"/>
+        <w:gridCol w:w="841"/>
         <w:gridCol w:w="834"/>
         <w:gridCol w:w="737"/>
         <w:gridCol w:w="955"/>
         <w:gridCol w:w="1077"/>
         <w:gridCol w:w="1035"/>
-        <w:gridCol w:w="822"/>
-        <w:gridCol w:w="736"/>
+        <w:gridCol w:w="823"/>
+        <w:gridCol w:w="735"/>
         <w:gridCol w:w="1363"/>
       </w:tblGrid>
       <w:tr>
         <w:trPr/>
         <w:tc>
           <w:tcPr>
-            <w:tcW w:w="616" w:type="dxa"/>
-            <w:tcBorders/>
-          </w:tcPr>
-          <w:p>
-            <w:pPr>
-              <w:pStyle w:val="Normal"/>
-              <w:widowControl/>
+            <w:tcW w:w="615" w:type="dxa"/>
+            <w:tcBorders/>
+          </w:tcPr>
+          <w:p>
+            <w:pPr>
+              <w:pStyle w:val="Normal"/>
+              <w:widowControl/>
+              <w:suppressAutoHyphens w:val="true"/>
               <w:spacing w:lineRule="auto" w:line="240" w:before="0" w:after="0"/>
               <w:jc w:val="center"/>
               <w:rPr>
@@ -1421,13 +1417,14 @@
         </w:tc>
         <w:tc>
           <w:tcPr>
-            <w:tcW w:w="840" w:type="dxa"/>
-            <w:tcBorders/>
-          </w:tcPr>
-          <w:p>
-            <w:pPr>
-              <w:pStyle w:val="Normal"/>
-              <w:widowControl/>
+            <w:tcW w:w="841" w:type="dxa"/>
+            <w:tcBorders/>
+          </w:tcPr>
+          <w:p>
+            <w:pPr>
+              <w:pStyle w:val="Normal"/>
+              <w:widowControl/>
+              <w:suppressAutoHyphens w:val="true"/>
               <w:spacing w:lineRule="auto" w:line="240" w:before="0" w:after="0"/>
               <w:jc w:val="center"/>
               <w:rPr>
@@ -1458,6 +1455,7 @@
             <w:pPr>
               <w:pStyle w:val="Normal"/>
               <w:widowControl/>
+              <w:suppressAutoHyphens w:val="true"/>
               <w:spacing w:lineRule="auto" w:line="240" w:before="0" w:after="0"/>
               <w:jc w:val="center"/>
               <w:rPr>
@@ -1488,6 +1486,7 @@
             <w:pPr>
               <w:pStyle w:val="Normal"/>
               <w:widowControl/>
+              <w:suppressAutoHyphens w:val="true"/>
               <w:spacing w:lineRule="auto" w:line="240" w:before="0" w:after="0"/>
               <w:jc w:val="center"/>
               <w:rPr>
@@ -1518,6 +1517,7 @@
             <w:pPr>
               <w:pStyle w:val="Normal"/>
               <w:widowControl/>
+              <w:suppressAutoHyphens w:val="true"/>
               <w:spacing w:lineRule="auto" w:line="240" w:before="0" w:after="0"/>
               <w:jc w:val="center"/>
               <w:rPr>
@@ -1548,6 +1548,7 @@
             <w:pPr>
               <w:pStyle w:val="Normal"/>
               <w:widowControl/>
+              <w:suppressAutoHyphens w:val="true"/>
               <w:spacing w:lineRule="auto" w:line="240" w:before="0" w:after="0"/>
               <w:jc w:val="center"/>
               <w:rPr>
@@ -1578,6 +1579,7 @@
             <w:pPr>
               <w:pStyle w:val="Normal"/>
               <w:widowControl/>
+              <w:suppressAutoHyphens w:val="true"/>
               <w:spacing w:lineRule="auto" w:line="240" w:before="0" w:after="0"/>
               <w:jc w:val="center"/>
               <w:rPr>
@@ -1601,13 +1603,14 @@
         </w:tc>
         <w:tc>
           <w:tcPr>
-            <w:tcW w:w="822" w:type="dxa"/>
-            <w:tcBorders/>
-          </w:tcPr>
-          <w:p>
-            <w:pPr>
-              <w:pStyle w:val="Normal"/>
-              <w:widowControl/>
+            <w:tcW w:w="823" w:type="dxa"/>
+            <w:tcBorders/>
+          </w:tcPr>
+          <w:p>
+            <w:pPr>
+              <w:pStyle w:val="Normal"/>
+              <w:widowControl/>
+              <w:suppressAutoHyphens w:val="true"/>
               <w:spacing w:lineRule="auto" w:line="240" w:before="0" w:after="0"/>
               <w:jc w:val="center"/>
               <w:rPr>
@@ -1631,13 +1634,14 @@
         </w:tc>
         <w:tc>
           <w:tcPr>
-            <w:tcW w:w="736" w:type="dxa"/>
-            <w:tcBorders/>
-          </w:tcPr>
-          <w:p>
-            <w:pPr>
-              <w:pStyle w:val="Normal"/>
-              <w:widowControl/>
+            <w:tcW w:w="735" w:type="dxa"/>
+            <w:tcBorders/>
+          </w:tcPr>
+          <w:p>
+            <w:pPr>
+              <w:pStyle w:val="Normal"/>
+              <w:widowControl/>
+              <w:suppressAutoHyphens w:val="true"/>
               <w:spacing w:lineRule="auto" w:line="240" w:before="0" w:after="0"/>
               <w:jc w:val="center"/>
               <w:rPr>
@@ -1668,6 +1672,7 @@
             <w:pPr>
               <w:pStyle w:val="Normal"/>
               <w:widowControl/>
+              <w:suppressAutoHyphens w:val="true"/>
               <w:spacing w:lineRule="auto" w:line="240" w:before="0" w:after="0"/>
               <w:jc w:val="center"/>
               <w:rPr>
@@ -1702,6 +1707,7 @@
             <w:pPr>
               <w:pStyle w:val="Normal"/>
               <w:widowControl/>
+              <w:suppressAutoHyphens w:val="true"/>
               <w:spacing w:lineRule="auto" w:line="240" w:before="0" w:after="0"/>
               <w:jc w:val="left"/>
               <w:rPr>
@@ -1729,13 +1735,14 @@
         <w:trPr/>
         <w:tc>
           <w:tcPr>
-            <w:tcW w:w="616" w:type="dxa"/>
-            <w:tcBorders/>
-          </w:tcPr>
-          <w:p>
-            <w:pPr>
-              <w:pStyle w:val="Normal"/>
-              <w:widowControl/>
+            <w:tcW w:w="615" w:type="dxa"/>
+            <w:tcBorders/>
+          </w:tcPr>
+          <w:p>
+            <w:pPr>
+              <w:pStyle w:val="Normal"/>
+              <w:widowControl/>
+              <w:suppressAutoHyphens w:val="true"/>
               <w:spacing w:lineRule="auto" w:line="240" w:before="0" w:after="0"/>
               <w:jc w:val="left"/>
               <w:rPr>
@@ -1760,13 +1767,14 @@
         </w:tc>
         <w:tc>
           <w:tcPr>
-            <w:tcW w:w="840" w:type="dxa"/>
-            <w:tcBorders/>
-          </w:tcPr>
-          <w:p>
-            <w:pPr>
-              <w:pStyle w:val="Normal"/>
-              <w:widowControl/>
+            <w:tcW w:w="841" w:type="dxa"/>
+            <w:tcBorders/>
+          </w:tcPr>
+          <w:p>
+            <w:pPr>
+              <w:pStyle w:val="Normal"/>
+              <w:widowControl/>
+              <w:suppressAutoHyphens w:val="true"/>
               <w:spacing w:lineRule="auto" w:line="240" w:before="0" w:after="0"/>
               <w:jc w:val="left"/>
               <w:rPr>
@@ -1798,6 +1806,7 @@
             <w:pPr>
               <w:pStyle w:val="Normal"/>
               <w:widowControl/>
+              <w:suppressAutoHyphens w:val="true"/>
               <w:spacing w:lineRule="auto" w:line="240" w:before="0" w:after="0"/>
               <w:jc w:val="left"/>
               <w:rPr>
@@ -1829,6 +1838,7 @@
             <w:pPr>
               <w:pStyle w:val="Normal"/>
               <w:widowControl/>
+              <w:suppressAutoHyphens w:val="true"/>
               <w:spacing w:lineRule="auto" w:line="240" w:before="0" w:after="0"/>
               <w:jc w:val="left"/>
               <w:rPr>
@@ -1860,6 +1870,7 @@
             <w:pPr>
               <w:pStyle w:val="Normal"/>
               <w:widowControl/>
+              <w:suppressAutoHyphens w:val="true"/>
               <w:spacing w:lineRule="auto" w:line="240" w:before="0" w:after="0"/>
               <w:jc w:val="left"/>
               <w:rPr>
@@ -1891,6 +1902,7 @@
             <w:pPr>
               <w:pStyle w:val="Normal"/>
               <w:widowControl/>
+              <w:suppressAutoHyphens w:val="true"/>
               <w:spacing w:lineRule="auto" w:line="240" w:before="0" w:after="0"/>
               <w:jc w:val="left"/>
               <w:rPr>
@@ -1922,6 +1934,7 @@
             <w:pPr>
               <w:pStyle w:val="Normal"/>
               <w:widowControl/>
+              <w:suppressAutoHyphens w:val="true"/>
               <w:spacing w:lineRule="auto" w:line="240" w:before="0" w:after="0"/>
               <w:jc w:val="left"/>
               <w:rPr>
@@ -1946,13 +1959,14 @@
         </w:tc>
         <w:tc>
           <w:tcPr>
-            <w:tcW w:w="822" w:type="dxa"/>
-            <w:tcBorders/>
-          </w:tcPr>
-          <w:p>
-            <w:pPr>
-              <w:pStyle w:val="Normal"/>
-              <w:widowControl/>
+            <w:tcW w:w="823" w:type="dxa"/>
+            <w:tcBorders/>
+          </w:tcPr>
+          <w:p>
+            <w:pPr>
+              <w:pStyle w:val="Normal"/>
+              <w:widowControl/>
+              <w:suppressAutoHyphens w:val="true"/>
               <w:spacing w:lineRule="auto" w:line="240" w:before="0" w:after="0"/>
               <w:jc w:val="left"/>
               <w:rPr>
@@ -1977,13 +1991,14 @@
         </w:tc>
         <w:tc>
           <w:tcPr>
-            <w:tcW w:w="736" w:type="dxa"/>
-            <w:tcBorders/>
-          </w:tcPr>
-          <w:p>
-            <w:pPr>
-              <w:pStyle w:val="Normal"/>
-              <w:widowControl/>
+            <w:tcW w:w="735" w:type="dxa"/>
+            <w:tcBorders/>
+          </w:tcPr>
+          <w:p>
+            <w:pPr>
+              <w:pStyle w:val="Normal"/>
+              <w:widowControl/>
+              <w:suppressAutoHyphens w:val="true"/>
               <w:spacing w:lineRule="auto" w:line="240" w:before="0" w:after="0"/>
               <w:jc w:val="left"/>
               <w:rPr>
@@ -2015,6 +2030,7 @@
             <w:pPr>
               <w:pStyle w:val="Normal"/>
               <w:widowControl/>
+              <w:suppressAutoHyphens w:val="true"/>
               <w:spacing w:lineRule="auto" w:line="240" w:before="0" w:after="0"/>
               <w:jc w:val="left"/>
               <w:rPr>
@@ -2050,6 +2066,7 @@
             <w:pPr>
               <w:pStyle w:val="Normal"/>
               <w:widowControl/>
+              <w:suppressAutoHyphens w:val="true"/>
               <w:spacing w:lineRule="auto" w:line="240" w:before="0" w:after="0"/>
               <w:jc w:val="left"/>
               <w:rPr>
@@ -2147,8 +2164,8 @@
         <w:gridCol w:w="862"/>
         <w:gridCol w:w="1130"/>
         <w:gridCol w:w="1284"/>
-        <w:gridCol w:w="1231"/>
-        <w:gridCol w:w="964"/>
+        <w:gridCol w:w="1232"/>
+        <w:gridCol w:w="963"/>
         <w:gridCol w:w="861"/>
       </w:tblGrid>
       <w:tr>
@@ -2162,6 +2179,7 @@
             <w:pPr>
               <w:pStyle w:val="Normal"/>
               <w:widowControl/>
+              <w:suppressAutoHyphens w:val="true"/>
               <w:spacing w:lineRule="auto" w:line="240" w:before="0" w:after="0"/>
               <w:jc w:val="center"/>
               <w:rPr>
@@ -2192,6 +2210,7 @@
             <w:pPr>
               <w:pStyle w:val="Normal"/>
               <w:widowControl/>
+              <w:suppressAutoHyphens w:val="true"/>
               <w:spacing w:lineRule="auto" w:line="240" w:before="0" w:after="0"/>
               <w:jc w:val="center"/>
               <w:rPr>
@@ -2222,6 +2241,7 @@
             <w:pPr>
               <w:pStyle w:val="Normal"/>
               <w:widowControl/>
+              <w:suppressAutoHyphens w:val="true"/>
               <w:spacing w:lineRule="auto" w:line="240" w:before="0" w:after="0"/>
               <w:jc w:val="center"/>
               <w:rPr>
@@ -2252,6 +2272,7 @@
             <w:pPr>
               <w:pStyle w:val="Normal"/>
               <w:widowControl/>
+              <w:suppressAutoHyphens w:val="true"/>
               <w:spacing w:lineRule="auto" w:line="240" w:before="0" w:after="0"/>
               <w:jc w:val="center"/>
               <w:rPr>
@@ -2282,6 +2303,7 @@
             <w:pPr>
               <w:pStyle w:val="Normal"/>
               <w:widowControl/>
+              <w:suppressAutoHyphens w:val="true"/>
               <w:spacing w:lineRule="auto" w:line="240" w:before="0" w:after="0"/>
               <w:jc w:val="center"/>
               <w:rPr>
@@ -2312,6 +2334,7 @@
             <w:pPr>
               <w:pStyle w:val="Normal"/>
               <w:widowControl/>
+              <w:suppressAutoHyphens w:val="true"/>
               <w:spacing w:lineRule="auto" w:line="240" w:before="0" w:after="0"/>
               <w:jc w:val="center"/>
               <w:rPr>
@@ -2335,13 +2358,14 @@
         </w:tc>
         <w:tc>
           <w:tcPr>
-            <w:tcW w:w="1231" w:type="dxa"/>
-            <w:tcBorders/>
-          </w:tcPr>
-          <w:p>
-            <w:pPr>
-              <w:pStyle w:val="Normal"/>
-              <w:widowControl/>
+            <w:tcW w:w="1232" w:type="dxa"/>
+            <w:tcBorders/>
+          </w:tcPr>
+          <w:p>
+            <w:pPr>
+              <w:pStyle w:val="Normal"/>
+              <w:widowControl/>
+              <w:suppressAutoHyphens w:val="true"/>
               <w:spacing w:lineRule="auto" w:line="240" w:before="0" w:after="0"/>
               <w:jc w:val="center"/>
               <w:rPr>
@@ -2365,13 +2389,14 @@
         </w:tc>
         <w:tc>
           <w:tcPr>
-            <w:tcW w:w="964" w:type="dxa"/>
-            <w:tcBorders/>
-          </w:tcPr>
-          <w:p>
-            <w:pPr>
-              <w:pStyle w:val="Normal"/>
-              <w:widowControl/>
+            <w:tcW w:w="963" w:type="dxa"/>
+            <w:tcBorders/>
+          </w:tcPr>
+          <w:p>
+            <w:pPr>
+              <w:pStyle w:val="Normal"/>
+              <w:widowControl/>
+              <w:suppressAutoHyphens w:val="true"/>
               <w:spacing w:lineRule="auto" w:line="240" w:before="0" w:after="0"/>
               <w:jc w:val="center"/>
               <w:rPr>
@@ -2402,6 +2427,7 @@
             <w:pPr>
               <w:pStyle w:val="Normal"/>
               <w:widowControl/>
+              <w:suppressAutoHyphens w:val="true"/>
               <w:spacing w:lineRule="auto" w:line="240" w:before="0" w:after="0"/>
               <w:jc w:val="center"/>
               <w:rPr>
@@ -2436,6 +2462,7 @@
             <w:pPr>
               <w:pStyle w:val="Normal"/>
               <w:widowControl/>
+              <w:suppressAutoHyphens w:val="true"/>
               <w:spacing w:lineRule="auto" w:line="240" w:before="0" w:after="0"/>
               <w:jc w:val="left"/>
               <w:rPr>
@@ -2470,6 +2497,7 @@
             <w:pPr>
               <w:pStyle w:val="Normal"/>
               <w:widowControl/>
+              <w:suppressAutoHyphens w:val="true"/>
               <w:spacing w:lineRule="auto" w:line="240" w:before="0" w:after="0"/>
               <w:jc w:val="left"/>
               <w:rPr>
@@ -2501,6 +2529,7 @@
             <w:pPr>
               <w:pStyle w:val="Normal"/>
               <w:widowControl/>
+              <w:suppressAutoHyphens w:val="true"/>
               <w:spacing w:lineRule="auto" w:line="240" w:before="0" w:after="0"/>
               <w:jc w:val="left"/>
               <w:rPr>
@@ -2532,6 +2561,7 @@
             <w:pPr>
               <w:pStyle w:val="Normal"/>
               <w:widowControl/>
+              <w:suppressAutoHyphens w:val="true"/>
               <w:spacing w:lineRule="auto" w:line="240" w:before="0" w:after="0"/>
               <w:jc w:val="left"/>
               <w:rPr>
@@ -2563,6 +2593,7 @@
             <w:pPr>
               <w:pStyle w:val="Normal"/>
               <w:widowControl/>
+              <w:suppressAutoHyphens w:val="true"/>
               <w:spacing w:lineRule="auto" w:line="240" w:before="0" w:after="0"/>
               <w:jc w:val="left"/>
               <w:rPr>
@@ -2594,6 +2625,7 @@
             <w:pPr>
               <w:pStyle w:val="Normal"/>
               <w:widowControl/>
+              <w:suppressAutoHyphens w:val="true"/>
               <w:spacing w:lineRule="auto" w:line="240" w:before="0" w:after="0"/>
               <w:jc w:val="left"/>
               <w:rPr>
@@ -2625,6 +2657,7 @@
             <w:pPr>
               <w:pStyle w:val="Normal"/>
               <w:widowControl/>
+              <w:suppressAutoHyphens w:val="true"/>
               <w:spacing w:lineRule="auto" w:line="240" w:before="0" w:after="0"/>
               <w:jc w:val="left"/>
               <w:rPr>
@@ -2649,13 +2682,14 @@
         </w:tc>
         <w:tc>
           <w:tcPr>
-            <w:tcW w:w="1231" w:type="dxa"/>
-            <w:tcBorders/>
-          </w:tcPr>
-          <w:p>
-            <w:pPr>
-              <w:pStyle w:val="Normal"/>
-              <w:widowControl/>
+            <w:tcW w:w="1232" w:type="dxa"/>
+            <w:tcBorders/>
+          </w:tcPr>
+          <w:p>
+            <w:pPr>
+              <w:pStyle w:val="Normal"/>
+              <w:widowControl/>
+              <w:suppressAutoHyphens w:val="true"/>
               <w:spacing w:lineRule="auto" w:line="240" w:before="0" w:after="0"/>
               <w:jc w:val="left"/>
               <w:rPr>
@@ -2680,13 +2714,14 @@
         </w:tc>
         <w:tc>
           <w:tcPr>
-            <w:tcW w:w="964" w:type="dxa"/>
-            <w:tcBorders/>
-          </w:tcPr>
-          <w:p>
-            <w:pPr>
-              <w:pStyle w:val="Normal"/>
-              <w:widowControl/>
+            <w:tcW w:w="963" w:type="dxa"/>
+            <w:tcBorders/>
+          </w:tcPr>
+          <w:p>
+            <w:pPr>
+              <w:pStyle w:val="Normal"/>
+              <w:widowControl/>
+              <w:suppressAutoHyphens w:val="true"/>
               <w:spacing w:lineRule="auto" w:line="240" w:before="0" w:after="0"/>
               <w:jc w:val="left"/>
               <w:rPr>
@@ -2718,6 +2753,7 @@
             <w:pPr>
               <w:pStyle w:val="Normal"/>
               <w:widowControl/>
+              <w:suppressAutoHyphens w:val="true"/>
               <w:spacing w:lineRule="auto" w:line="240" w:before="0" w:after="0"/>
               <w:jc w:val="left"/>
               <w:rPr>
@@ -2753,6 +2789,7 @@
             <w:pPr>
               <w:pStyle w:val="Normal"/>
               <w:widowControl/>
+              <w:suppressAutoHyphens w:val="true"/>
               <w:spacing w:lineRule="auto" w:line="240" w:before="0" w:after="0"/>
               <w:jc w:val="left"/>
               <w:rPr>
@@ -2846,8 +2883,8 @@
         <w:gridCol w:w="862"/>
         <w:gridCol w:w="1130"/>
         <w:gridCol w:w="1284"/>
-        <w:gridCol w:w="1231"/>
-        <w:gridCol w:w="964"/>
+        <w:gridCol w:w="1232"/>
+        <w:gridCol w:w="963"/>
         <w:gridCol w:w="861"/>
       </w:tblGrid>
       <w:tr>
@@ -2861,6 +2898,7 @@
             <w:pPr>
               <w:pStyle w:val="Normal"/>
               <w:widowControl/>
+              <w:suppressAutoHyphens w:val="true"/>
               <w:spacing w:lineRule="auto" w:line="240" w:before="0" w:after="0"/>
               <w:jc w:val="center"/>
               <w:rPr>
@@ -2891,6 +2929,7 @@
             <w:pPr>
               <w:pStyle w:val="Normal"/>
               <w:widowControl/>
+              <w:suppressAutoHyphens w:val="true"/>
               <w:spacing w:lineRule="auto" w:line="240" w:before="0" w:after="0"/>
               <w:jc w:val="center"/>
               <w:rPr>
@@ -2921,6 +2960,7 @@
             <w:pPr>
               <w:pStyle w:val="Normal"/>
               <w:widowControl/>
+              <w:suppressAutoHyphens w:val="true"/>
               <w:spacing w:lineRule="auto" w:line="240" w:before="0" w:after="0"/>
               <w:jc w:val="center"/>
               <w:rPr>
@@ -2951,6 +2991,7 @@
             <w:pPr>
               <w:pStyle w:val="Normal"/>
               <w:widowControl/>
+              <w:suppressAutoHyphens w:val="true"/>
               <w:spacing w:lineRule="auto" w:line="240" w:before="0" w:after="0"/>
               <w:jc w:val="center"/>
               <w:rPr>
@@ -2981,6 +3022,7 @@
             <w:pPr>
               <w:pStyle w:val="Normal"/>
               <w:widowControl/>
+              <w:suppressAutoHyphens w:val="true"/>
               <w:spacing w:lineRule="auto" w:line="240" w:before="0" w:after="0"/>
               <w:jc w:val="center"/>
               <w:rPr>
@@ -3011,6 +3053,7 @@
             <w:pPr>
               <w:pStyle w:val="Normal"/>
               <w:widowControl/>
+              <w:suppressAutoHyphens w:val="true"/>
               <w:spacing w:lineRule="auto" w:line="240" w:before="0" w:after="0"/>
               <w:jc w:val="center"/>
               <w:rPr>
@@ -3034,13 +3077,14 @@
         </w:tc>
         <w:tc>
           <w:tcPr>
-            <w:tcW w:w="1231" w:type="dxa"/>
-            <w:tcBorders/>
-          </w:tcPr>
-          <w:p>
-            <w:pPr>
-              <w:pStyle w:val="Normal"/>
-              <w:widowControl/>
+            <w:tcW w:w="1232" w:type="dxa"/>
+            <w:tcBorders/>
+          </w:tcPr>
+          <w:p>
+            <w:pPr>
+              <w:pStyle w:val="Normal"/>
+              <w:widowControl/>
+              <w:suppressAutoHyphens w:val="true"/>
               <w:spacing w:lineRule="auto" w:line="240" w:before="0" w:after="0"/>
               <w:jc w:val="center"/>
               <w:rPr>
@@ -3064,13 +3108,14 @@
         </w:tc>
         <w:tc>
           <w:tcPr>
-            <w:tcW w:w="964" w:type="dxa"/>
-            <w:tcBorders/>
-          </w:tcPr>
-          <w:p>
-            <w:pPr>
-              <w:pStyle w:val="Normal"/>
-              <w:widowControl/>
+            <w:tcW w:w="963" w:type="dxa"/>
+            <w:tcBorders/>
+          </w:tcPr>
+          <w:p>
+            <w:pPr>
+              <w:pStyle w:val="Normal"/>
+              <w:widowControl/>
+              <w:suppressAutoHyphens w:val="true"/>
               <w:spacing w:lineRule="auto" w:line="240" w:before="0" w:after="0"/>
               <w:jc w:val="center"/>
               <w:rPr>
@@ -3101,6 +3146,7 @@
             <w:pPr>
               <w:pStyle w:val="Normal"/>
               <w:widowControl/>
+              <w:suppressAutoHyphens w:val="true"/>
               <w:spacing w:lineRule="auto" w:line="240" w:before="0" w:after="0"/>
               <w:jc w:val="center"/>
               <w:rPr>
@@ -3135,6 +3181,7 @@
             <w:pPr>
               <w:pStyle w:val="Normal"/>
               <w:widowControl/>
+              <w:suppressAutoHyphens w:val="true"/>
               <w:spacing w:lineRule="auto" w:line="240" w:before="0" w:after="0"/>
               <w:jc w:val="left"/>
               <w:rPr>
@@ -3153,27 +3200,7 @@
                 <w:szCs w:val="22"/>
                 <w:lang w:val="en-AU" w:eastAsia="ja-JP" w:bidi="ar-SA"/>
               </w:rPr>
-              <w:t xml:space="preserve">{%tr for i in </w:t>
-            </w:r>
-            <w:r>
-              <w:rPr>
-                <w:rFonts w:eastAsia="游ゴシック" w:cs=""/>
-                <w:kern w:val="2"/>
-                <w:sz w:val="22"/>
-                <w:szCs w:val="22"/>
-                <w:lang w:val="en-AU" w:eastAsia="ja-JP" w:bidi="ar-SA"/>
-              </w:rPr>
-              <w:t xml:space="preserve">sus_files </w:t>
-            </w:r>
-            <w:r>
-              <w:rPr>
-                <w:rFonts w:eastAsia="游ゴシック" w:cs=""/>
-                <w:kern w:val="2"/>
-                <w:sz w:val="22"/>
-                <w:szCs w:val="22"/>
-                <w:lang w:val="en-AU" w:eastAsia="ja-JP" w:bidi="ar-SA"/>
-              </w:rPr>
-              <w:t>%}</w:t>
+              <w:t>{%tr for i in sus_files %}</w:t>
             </w:r>
           </w:p>
         </w:tc>
@@ -3189,6 +3216,7 @@
             <w:pPr>
               <w:pStyle w:val="Normal"/>
               <w:widowControl/>
+              <w:suppressAutoHyphens w:val="true"/>
               <w:spacing w:lineRule="auto" w:line="240" w:before="0" w:after="0"/>
               <w:jc w:val="left"/>
               <w:rPr>
@@ -3220,6 +3248,7 @@
             <w:pPr>
               <w:pStyle w:val="Normal"/>
               <w:widowControl/>
+              <w:suppressAutoHyphens w:val="true"/>
               <w:spacing w:lineRule="auto" w:line="240" w:before="0" w:after="0"/>
               <w:jc w:val="left"/>
               <w:rPr>
@@ -3251,6 +3280,7 @@
             <w:pPr>
               <w:pStyle w:val="Normal"/>
               <w:widowControl/>
+              <w:suppressAutoHyphens w:val="true"/>
               <w:spacing w:lineRule="auto" w:line="240" w:before="0" w:after="0"/>
               <w:jc w:val="left"/>
               <w:rPr>
@@ -3282,6 +3312,7 @@
             <w:pPr>
               <w:pStyle w:val="Normal"/>
               <w:widowControl/>
+              <w:suppressAutoHyphens w:val="true"/>
               <w:spacing w:lineRule="auto" w:line="240" w:before="0" w:after="0"/>
               <w:jc w:val="left"/>
               <w:rPr>
@@ -3313,6 +3344,7 @@
             <w:pPr>
               <w:pStyle w:val="Normal"/>
               <w:widowControl/>
+              <w:suppressAutoHyphens w:val="true"/>
               <w:spacing w:lineRule="auto" w:line="240" w:before="0" w:after="0"/>
               <w:jc w:val="left"/>
               <w:rPr>
@@ -3344,6 +3376,7 @@
             <w:pPr>
               <w:pStyle w:val="Normal"/>
               <w:widowControl/>
+              <w:suppressAutoHyphens w:val="true"/>
               <w:spacing w:lineRule="auto" w:line="240" w:before="0" w:after="0"/>
               <w:jc w:val="left"/>
               <w:rPr>
@@ -3368,13 +3401,14 @@
         </w:tc>
         <w:tc>
           <w:tcPr>
-            <w:tcW w:w="1231" w:type="dxa"/>
-            <w:tcBorders/>
-          </w:tcPr>
-          <w:p>
-            <w:pPr>
-              <w:pStyle w:val="Normal"/>
-              <w:widowControl/>
+            <w:tcW w:w="1232" w:type="dxa"/>
+            <w:tcBorders/>
+          </w:tcPr>
+          <w:p>
+            <w:pPr>
+              <w:pStyle w:val="Normal"/>
+              <w:widowControl/>
+              <w:suppressAutoHyphens w:val="true"/>
               <w:spacing w:lineRule="auto" w:line="240" w:before="0" w:after="0"/>
               <w:jc w:val="left"/>
               <w:rPr>
@@ -3399,13 +3433,14 @@
         </w:tc>
         <w:tc>
           <w:tcPr>
-            <w:tcW w:w="964" w:type="dxa"/>
-            <w:tcBorders/>
-          </w:tcPr>
-          <w:p>
-            <w:pPr>
-              <w:pStyle w:val="Normal"/>
-              <w:widowControl/>
+            <w:tcW w:w="963" w:type="dxa"/>
+            <w:tcBorders/>
+          </w:tcPr>
+          <w:p>
+            <w:pPr>
+              <w:pStyle w:val="Normal"/>
+              <w:widowControl/>
+              <w:suppressAutoHyphens w:val="true"/>
               <w:spacing w:lineRule="auto" w:line="240" w:before="0" w:after="0"/>
               <w:jc w:val="left"/>
               <w:rPr>
@@ -3437,6 +3472,7 @@
             <w:pPr>
               <w:pStyle w:val="Normal"/>
               <w:widowControl/>
+              <w:suppressAutoHyphens w:val="true"/>
               <w:spacing w:lineRule="auto" w:line="240" w:before="0" w:after="0"/>
               <w:jc w:val="left"/>
               <w:rPr>
@@ -3472,6 +3508,7 @@
             <w:pPr>
               <w:pStyle w:val="Normal"/>
               <w:widowControl/>
+              <w:suppressAutoHyphens w:val="true"/>
               <w:spacing w:lineRule="auto" w:line="240" w:before="0" w:after="0"/>
               <w:jc w:val="left"/>
               <w:rPr>
@@ -3546,9 +3583,9 @@
     <w:tbl>
       <w:tblPr>
         <w:tblStyle w:val="TableGrid"/>
-        <w:tblW w:w="9016" w:type="dxa"/>
+        <w:tblW w:w="10639" w:type="dxa"/>
         <w:jc w:val="left"/>
-        <w:tblInd w:w="0" w:type="dxa"/>
+        <w:tblInd w:w="-582" w:type="dxa"/>
         <w:tblLayout w:type="fixed"/>
         <w:tblCellMar>
           <w:top w:w="0" w:type="dxa"/>
@@ -3559,20 +3596,31 @@
         <w:tblLook w:val="04a0" w:noHBand="0" w:noVBand="1" w:firstColumn="1" w:lastRow="0" w:lastColumn="0" w:firstRow="1"/>
       </w:tblPr>
       <w:tblGrid>
-        <w:gridCol w:w="4508"/>
-        <w:gridCol w:w="4507"/>
+        <w:gridCol w:w="556"/>
+        <w:gridCol w:w="1000"/>
+        <w:gridCol w:w="1069"/>
+        <w:gridCol w:w="1111"/>
+        <w:gridCol w:w="1236"/>
+        <w:gridCol w:w="1167"/>
+        <w:gridCol w:w="1347"/>
+        <w:gridCol w:w="1264"/>
+        <w:gridCol w:w="986"/>
+        <w:gridCol w:w="903"/>
       </w:tblGrid>
       <w:tr>
         <w:trPr/>
         <w:tc>
           <w:tcPr>
-            <w:tcW w:w="4508" w:type="dxa"/>
-            <w:tcBorders/>
-          </w:tcPr>
-          <w:p>
-            <w:pPr>
-              <w:pStyle w:val="Normal"/>
-              <w:widowControl/>
+            <w:tcW w:w="556" w:type="dxa"/>
+            <w:tcBorders>
+              <w:right w:val="nil"/>
+            </w:tcBorders>
+          </w:tcPr>
+          <w:p>
+            <w:pPr>
+              <w:pStyle w:val="Normal"/>
+              <w:widowControl/>
+              <w:suppressAutoHyphens w:val="true"/>
               <w:spacing w:lineRule="auto" w:line="240" w:before="0" w:after="0"/>
               <w:jc w:val="center"/>
               <w:rPr>
@@ -3596,13 +3644,16 @@
         </w:tc>
         <w:tc>
           <w:tcPr>
-            <w:tcW w:w="4507" w:type="dxa"/>
-            <w:tcBorders/>
-          </w:tcPr>
-          <w:p>
-            <w:pPr>
-              <w:pStyle w:val="Normal"/>
-              <w:widowControl/>
+            <w:tcW w:w="1000" w:type="dxa"/>
+            <w:tcBorders>
+              <w:right w:val="nil"/>
+            </w:tcBorders>
+          </w:tcPr>
+          <w:p>
+            <w:pPr>
+              <w:pStyle w:val="Normal"/>
+              <w:widowControl/>
+              <w:suppressAutoHyphens w:val="true"/>
               <w:spacing w:lineRule="auto" w:line="240" w:before="0" w:after="0"/>
               <w:jc w:val="center"/>
               <w:rPr>
@@ -3612,15 +3663,230 @@
             </w:pPr>
             <w:r>
               <w:rPr>
-                <w:rFonts w:eastAsia="游ゴシック" w:cs=""/>
-                <w:b/>
-                <w:bCs/>
-                <w:kern w:val="2"/>
-                <w:sz w:val="22"/>
-                <w:szCs w:val="22"/>
-                <w:lang w:val="en-AU" w:eastAsia="ja-JP" w:bidi="ar-SA"/>
+                <w:b/>
+                <w:bCs/>
+              </w:rPr>
+              <w:t>Name</w:t>
+            </w:r>
+          </w:p>
+        </w:tc>
+        <w:tc>
+          <w:tcPr>
+            <w:tcW w:w="1069" w:type="dxa"/>
+            <w:tcBorders>
+              <w:right w:val="nil"/>
+            </w:tcBorders>
+          </w:tcPr>
+          <w:p>
+            <w:pPr>
+              <w:pStyle w:val="Normal"/>
+              <w:widowControl/>
+              <w:suppressAutoHyphens w:val="true"/>
+              <w:spacing w:lineRule="auto" w:line="240" w:before="0" w:after="0"/>
+              <w:jc w:val="center"/>
+              <w:rPr>
+                <w:b/>
+                <w:bCs/>
+              </w:rPr>
+            </w:pPr>
+            <w:r>
+              <w:rPr>
+                <w:b/>
+                <w:bCs/>
+              </w:rPr>
+              <w:t>iNode</w:t>
+            </w:r>
+          </w:p>
+        </w:tc>
+        <w:tc>
+          <w:tcPr>
+            <w:tcW w:w="1111" w:type="dxa"/>
+            <w:tcBorders>
+              <w:right w:val="nil"/>
+            </w:tcBorders>
+          </w:tcPr>
+          <w:p>
+            <w:pPr>
+              <w:pStyle w:val="Normal"/>
+              <w:widowControl/>
+              <w:suppressAutoHyphens w:val="true"/>
+              <w:spacing w:lineRule="auto" w:line="240" w:before="0" w:after="0"/>
+              <w:jc w:val="center"/>
+              <w:rPr>
+                <w:b/>
+                <w:bCs/>
+              </w:rPr>
+            </w:pPr>
+            <w:r>
+              <w:rPr>
+                <w:b/>
+                <w:bCs/>
+              </w:rPr>
+              <w:t>Path</w:t>
+            </w:r>
+          </w:p>
+        </w:tc>
+        <w:tc>
+          <w:tcPr>
+            <w:tcW w:w="1236" w:type="dxa"/>
+            <w:tcBorders>
+              <w:right w:val="nil"/>
+            </w:tcBorders>
+          </w:tcPr>
+          <w:p>
+            <w:pPr>
+              <w:pStyle w:val="Normal"/>
+              <w:widowControl/>
+              <w:suppressAutoHyphens w:val="true"/>
+              <w:spacing w:lineRule="auto" w:line="240" w:before="0" w:after="0"/>
+              <w:jc w:val="center"/>
+              <w:rPr>
+                <w:b/>
+                <w:bCs/>
+              </w:rPr>
+            </w:pPr>
+            <w:r>
+              <w:rPr>
+                <w:b/>
+                <w:bCs/>
               </w:rPr>
               <w:t>Keyword</w:t>
+            </w:r>
+          </w:p>
+        </w:tc>
+        <w:tc>
+          <w:tcPr>
+            <w:tcW w:w="1167" w:type="dxa"/>
+            <w:tcBorders>
+              <w:right w:val="nil"/>
+            </w:tcBorders>
+          </w:tcPr>
+          <w:p>
+            <w:pPr>
+              <w:pStyle w:val="Normal"/>
+              <w:widowControl/>
+              <w:suppressAutoHyphens w:val="true"/>
+              <w:spacing w:lineRule="auto" w:line="240" w:before="0" w:after="0"/>
+              <w:jc w:val="center"/>
+              <w:rPr>
+                <w:b/>
+                <w:bCs/>
+              </w:rPr>
+            </w:pPr>
+            <w:r>
+              <w:rPr>
+                <w:b/>
+                <w:bCs/>
+              </w:rPr>
+              <w:t>Created</w:t>
+            </w:r>
+          </w:p>
+        </w:tc>
+        <w:tc>
+          <w:tcPr>
+            <w:tcW w:w="1347" w:type="dxa"/>
+            <w:tcBorders>
+              <w:right w:val="nil"/>
+            </w:tcBorders>
+          </w:tcPr>
+          <w:p>
+            <w:pPr>
+              <w:pStyle w:val="Normal"/>
+              <w:widowControl/>
+              <w:suppressAutoHyphens w:val="true"/>
+              <w:spacing w:lineRule="auto" w:line="240" w:before="0" w:after="0"/>
+              <w:jc w:val="center"/>
+              <w:rPr>
+                <w:b/>
+                <w:bCs/>
+              </w:rPr>
+            </w:pPr>
+            <w:r>
+              <w:rPr>
+                <w:b/>
+                <w:bCs/>
+              </w:rPr>
+              <w:t>Accessed</w:t>
+            </w:r>
+          </w:p>
+        </w:tc>
+        <w:tc>
+          <w:tcPr>
+            <w:tcW w:w="1264" w:type="dxa"/>
+            <w:tcBorders>
+              <w:right w:val="nil"/>
+            </w:tcBorders>
+          </w:tcPr>
+          <w:p>
+            <w:pPr>
+              <w:pStyle w:val="Normal"/>
+              <w:widowControl/>
+              <w:suppressAutoHyphens w:val="true"/>
+              <w:spacing w:lineRule="auto" w:line="240" w:before="0" w:after="0"/>
+              <w:jc w:val="center"/>
+              <w:rPr>
+                <w:b/>
+                <w:bCs/>
+              </w:rPr>
+            </w:pPr>
+            <w:r>
+              <w:rPr>
+                <w:b/>
+                <w:bCs/>
+              </w:rPr>
+              <w:t>Modified</w:t>
+            </w:r>
+          </w:p>
+        </w:tc>
+        <w:tc>
+          <w:tcPr>
+            <w:tcW w:w="986" w:type="dxa"/>
+            <w:tcBorders/>
+          </w:tcPr>
+          <w:p>
+            <w:pPr>
+              <w:pStyle w:val="Normal"/>
+              <w:widowControl/>
+              <w:suppressAutoHyphens w:val="true"/>
+              <w:spacing w:lineRule="auto" w:line="240" w:before="0" w:after="0"/>
+              <w:jc w:val="center"/>
+              <w:rPr>
+                <w:b/>
+                <w:bCs/>
+              </w:rPr>
+            </w:pPr>
+            <w:r>
+              <w:rPr>
+                <w:b/>
+                <w:bCs/>
+              </w:rPr>
+              <w:t>Bytes</w:t>
+            </w:r>
+          </w:p>
+        </w:tc>
+        <w:tc>
+          <w:tcPr>
+            <w:tcW w:w="903" w:type="dxa"/>
+            <w:tcBorders/>
+          </w:tcPr>
+          <w:p>
+            <w:pPr>
+              <w:pStyle w:val="Normal"/>
+              <w:widowControl/>
+              <w:suppressAutoHyphens w:val="true"/>
+              <w:spacing w:lineRule="auto" w:line="240" w:before="0" w:after="0"/>
+              <w:jc w:val="center"/>
+              <w:rPr>
+                <w:b/>
+                <w:bCs/>
+              </w:rPr>
+            </w:pPr>
+            <w:r>
+              <w:rPr>
+                <w:b/>
+                <w:bCs/>
+              </w:rPr>
+              <w:t>MD5</w:t>
             </w:r>
           </w:p>
         </w:tc>
@@ -3629,14 +3895,15 @@
         <w:trPr/>
         <w:tc>
           <w:tcPr>
-            <w:tcW w:w="9015" w:type="dxa"/>
-            <w:gridSpan w:val="2"/>
-            <w:tcBorders/>
-          </w:tcPr>
-          <w:p>
-            <w:pPr>
-              <w:pStyle w:val="Normal"/>
-              <w:widowControl/>
+            <w:tcW w:w="10639" w:type="dxa"/>
+            <w:gridSpan w:val="10"/>
+            <w:tcBorders/>
+          </w:tcPr>
+          <w:p>
+            <w:pPr>
+              <w:pStyle w:val="Normal"/>
+              <w:widowControl/>
+              <w:suppressAutoHyphens w:val="true"/>
               <w:spacing w:lineRule="auto" w:line="240" w:before="0" w:after="0"/>
               <w:jc w:val="left"/>
               <w:rPr>
@@ -3664,13 +3931,16 @@
         <w:trPr/>
         <w:tc>
           <w:tcPr>
-            <w:tcW w:w="4508" w:type="dxa"/>
-            <w:tcBorders/>
-          </w:tcPr>
-          <w:p>
-            <w:pPr>
-              <w:pStyle w:val="Normal"/>
-              <w:widowControl/>
+            <w:tcW w:w="556" w:type="dxa"/>
+            <w:tcBorders>
+              <w:right w:val="nil"/>
+            </w:tcBorders>
+          </w:tcPr>
+          <w:p>
+            <w:pPr>
+              <w:pStyle w:val="Normal"/>
+              <w:widowControl/>
+              <w:suppressAutoHyphens w:val="true"/>
               <w:spacing w:lineRule="auto" w:line="240" w:before="0" w:after="0"/>
               <w:jc w:val="left"/>
               <w:rPr>
@@ -3695,13 +3965,16 @@
         </w:tc>
         <w:tc>
           <w:tcPr>
-            <w:tcW w:w="4507" w:type="dxa"/>
-            <w:tcBorders/>
-          </w:tcPr>
-          <w:p>
-            <w:pPr>
-              <w:pStyle w:val="Normal"/>
-              <w:widowControl/>
+            <w:tcW w:w="1000" w:type="dxa"/>
+            <w:tcBorders>
+              <w:right w:val="nil"/>
+            </w:tcBorders>
+          </w:tcPr>
+          <w:p>
+            <w:pPr>
+              <w:pStyle w:val="Normal"/>
+              <w:widowControl/>
+              <w:suppressAutoHyphens w:val="true"/>
               <w:spacing w:lineRule="auto" w:line="240" w:before="0" w:after="0"/>
               <w:jc w:val="left"/>
               <w:rPr>
@@ -3713,14 +3986,310 @@
               </w:rPr>
             </w:pPr>
             <w:r>
-              <w:rPr>
-                <w:rFonts w:eastAsia="游ゴシック" w:cs=""/>
-                <w:kern w:val="2"/>
-                <w:sz w:val="22"/>
-                <w:szCs w:val="22"/>
-                <w:lang w:val="en-AU" w:eastAsia="ja-JP" w:bidi="ar-SA"/>
-              </w:rPr>
-              <w:t>{{i.keyword}}</w:t>
+              <w:rPr/>
+              <w:t>{{i.name }}</w:t>
+            </w:r>
+          </w:p>
+        </w:tc>
+        <w:tc>
+          <w:tcPr>
+            <w:tcW w:w="1069" w:type="dxa"/>
+            <w:tcBorders>
+              <w:right w:val="nil"/>
+            </w:tcBorders>
+          </w:tcPr>
+          <w:p>
+            <w:pPr>
+              <w:pStyle w:val="Normal"/>
+              <w:widowControl/>
+              <w:suppressAutoHyphens w:val="true"/>
+              <w:spacing w:lineRule="auto" w:line="240" w:before="0" w:after="0"/>
+              <w:jc w:val="left"/>
+              <w:rPr>
+                <w:rFonts w:ascii="Aptos" w:hAnsi="Aptos" w:eastAsia="游ゴシック" w:cs=""/>
+                <w:kern w:val="2"/>
+                <w:sz w:val="22"/>
+                <w:szCs w:val="22"/>
+                <w:lang w:val="en-AU" w:eastAsia="ja-JP" w:bidi="ar-SA"/>
+              </w:rPr>
+            </w:pPr>
+            <w:r>
+              <w:rPr/>
+              <w:t>{{i.</w:t>
+            </w:r>
+            <w:r>
+              <w:rPr/>
+              <w:t>inode</w:t>
+            </w:r>
+            <w:r>
+              <w:rPr/>
+              <w:t xml:space="preserve"> }}</w:t>
+            </w:r>
+          </w:p>
+        </w:tc>
+        <w:tc>
+          <w:tcPr>
+            <w:tcW w:w="1111" w:type="dxa"/>
+            <w:tcBorders>
+              <w:right w:val="nil"/>
+            </w:tcBorders>
+          </w:tcPr>
+          <w:p>
+            <w:pPr>
+              <w:pStyle w:val="Normal"/>
+              <w:widowControl/>
+              <w:suppressAutoHyphens w:val="true"/>
+              <w:spacing w:lineRule="auto" w:line="240" w:before="0" w:after="0"/>
+              <w:jc w:val="left"/>
+              <w:rPr>
+                <w:rFonts w:ascii="Aptos" w:hAnsi="Aptos" w:eastAsia="游ゴシック" w:cs=""/>
+                <w:kern w:val="2"/>
+                <w:sz w:val="22"/>
+                <w:szCs w:val="22"/>
+                <w:lang w:val="en-AU" w:eastAsia="ja-JP" w:bidi="ar-SA"/>
+              </w:rPr>
+            </w:pPr>
+            <w:r>
+              <w:rPr/>
+              <w:t>{{i.</w:t>
+            </w:r>
+            <w:r>
+              <w:rPr/>
+              <w:t>path</w:t>
+            </w:r>
+            <w:r>
+              <w:rPr/>
+              <w:t xml:space="preserve"> }}</w:t>
+            </w:r>
+          </w:p>
+        </w:tc>
+        <w:tc>
+          <w:tcPr>
+            <w:tcW w:w="1236" w:type="dxa"/>
+            <w:tcBorders>
+              <w:right w:val="nil"/>
+            </w:tcBorders>
+          </w:tcPr>
+          <w:p>
+            <w:pPr>
+              <w:pStyle w:val="Normal"/>
+              <w:widowControl/>
+              <w:suppressAutoHyphens w:val="true"/>
+              <w:spacing w:lineRule="auto" w:line="240" w:before="0" w:after="0"/>
+              <w:jc w:val="left"/>
+              <w:rPr>
+                <w:rFonts w:ascii="Aptos" w:hAnsi="Aptos" w:eastAsia="游ゴシック" w:cs=""/>
+                <w:kern w:val="2"/>
+                <w:sz w:val="22"/>
+                <w:szCs w:val="22"/>
+                <w:lang w:val="en-AU" w:eastAsia="ja-JP" w:bidi="ar-SA"/>
+              </w:rPr>
+            </w:pPr>
+            <w:r>
+              <w:rPr/>
+              <w:t>{{i.</w:t>
+            </w:r>
+            <w:r>
+              <w:rPr/>
+              <w:t>keyword</w:t>
+            </w:r>
+            <w:r>
+              <w:rPr/>
+              <w:t xml:space="preserve"> }}</w:t>
+            </w:r>
+          </w:p>
+        </w:tc>
+        <w:tc>
+          <w:tcPr>
+            <w:tcW w:w="1167" w:type="dxa"/>
+            <w:tcBorders>
+              <w:right w:val="nil"/>
+            </w:tcBorders>
+          </w:tcPr>
+          <w:p>
+            <w:pPr>
+              <w:pStyle w:val="Normal"/>
+              <w:widowControl/>
+              <w:suppressAutoHyphens w:val="true"/>
+              <w:spacing w:lineRule="auto" w:line="240" w:before="0" w:after="0"/>
+              <w:jc w:val="left"/>
+              <w:rPr>
+                <w:rFonts w:ascii="Aptos" w:hAnsi="Aptos" w:eastAsia="游ゴシック" w:cs=""/>
+                <w:kern w:val="2"/>
+                <w:sz w:val="22"/>
+                <w:szCs w:val="22"/>
+                <w:lang w:val="en-AU" w:eastAsia="ja-JP" w:bidi="ar-SA"/>
+              </w:rPr>
+            </w:pPr>
+            <w:r>
+              <w:rPr/>
+              <w:t>{{i.</w:t>
+            </w:r>
+            <w:r>
+              <w:rPr/>
+              <w:t>created</w:t>
+            </w:r>
+            <w:r>
+              <w:rPr/>
+              <w:t xml:space="preserve"> }}</w:t>
+            </w:r>
+          </w:p>
+        </w:tc>
+        <w:tc>
+          <w:tcPr>
+            <w:tcW w:w="1347" w:type="dxa"/>
+            <w:tcBorders>
+              <w:right w:val="nil"/>
+            </w:tcBorders>
+          </w:tcPr>
+          <w:p>
+            <w:pPr>
+              <w:pStyle w:val="Normal"/>
+              <w:widowControl/>
+              <w:suppressAutoHyphens w:val="true"/>
+              <w:spacing w:lineRule="auto" w:line="240" w:before="0" w:after="0"/>
+              <w:jc w:val="left"/>
+              <w:rPr>
+                <w:rFonts w:ascii="Aptos" w:hAnsi="Aptos" w:eastAsia="游ゴシック" w:cs=""/>
+                <w:kern w:val="2"/>
+                <w:sz w:val="22"/>
+                <w:szCs w:val="22"/>
+                <w:lang w:val="en-AU" w:eastAsia="ja-JP" w:bidi="ar-SA"/>
+              </w:rPr>
+            </w:pPr>
+            <w:r>
+              <w:rPr/>
+              <w:t>{{i.</w:t>
+            </w:r>
+            <w:r>
+              <w:rPr/>
+              <w:t>accessed</w:t>
+            </w:r>
+            <w:r>
+              <w:rPr/>
+              <w:t xml:space="preserve"> }}</w:t>
+            </w:r>
+          </w:p>
+        </w:tc>
+        <w:tc>
+          <w:tcPr>
+            <w:tcW w:w="1264" w:type="dxa"/>
+            <w:tcBorders>
+              <w:right w:val="nil"/>
+            </w:tcBorders>
+          </w:tcPr>
+          <w:p>
+            <w:pPr>
+              <w:pStyle w:val="Normal"/>
+              <w:widowControl/>
+              <w:suppressAutoHyphens w:val="true"/>
+              <w:spacing w:lineRule="auto" w:line="240" w:before="0" w:after="0"/>
+              <w:jc w:val="left"/>
+              <w:rPr>
+                <w:rFonts w:ascii="Aptos" w:hAnsi="Aptos" w:eastAsia="游ゴシック" w:cs=""/>
+                <w:kern w:val="2"/>
+                <w:sz w:val="22"/>
+                <w:szCs w:val="22"/>
+                <w:lang w:val="en-AU" w:eastAsia="ja-JP" w:bidi="ar-SA"/>
+              </w:rPr>
+            </w:pPr>
+            <w:r>
+              <w:rPr/>
+              <w:t>{{i.</w:t>
+            </w:r>
+            <w:r>
+              <w:rPr/>
+              <w:t>modified</w:t>
+            </w:r>
+            <w:r>
+              <w:rPr/>
+              <w:t xml:space="preserve"> }}</w:t>
+            </w:r>
+          </w:p>
+        </w:tc>
+        <w:tc>
+          <w:tcPr>
+            <w:tcW w:w="986" w:type="dxa"/>
+            <w:tcBorders/>
+          </w:tcPr>
+          <w:p>
+            <w:pPr>
+              <w:pStyle w:val="Normal"/>
+              <w:widowControl/>
+              <w:suppressAutoHyphens w:val="true"/>
+              <w:spacing w:lineRule="auto" w:line="240" w:before="0" w:after="0"/>
+              <w:jc w:val="left"/>
+              <w:rPr>
+                <w:rFonts w:ascii="Aptos" w:hAnsi="Aptos" w:eastAsia="游ゴシック" w:cs=""/>
+                <w:kern w:val="2"/>
+                <w:sz w:val="22"/>
+                <w:szCs w:val="22"/>
+                <w:lang w:val="en-AU" w:eastAsia="ja-JP" w:bidi="ar-SA"/>
+              </w:rPr>
+            </w:pPr>
+            <w:r>
+              <w:rPr/>
+              <w:t>{{i.</w:t>
+            </w:r>
+            <w:r>
+              <w:rPr/>
+              <w:t>bytes</w:t>
+            </w:r>
+            <w:r>
+              <w:rPr/>
+              <w:t xml:space="preserve"> }}</w:t>
+            </w:r>
+          </w:p>
+        </w:tc>
+        <w:tc>
+          <w:tcPr>
+            <w:tcW w:w="903" w:type="dxa"/>
+            <w:tcBorders/>
+          </w:tcPr>
+          <w:p>
+            <w:pPr>
+              <w:pStyle w:val="Normal"/>
+              <w:widowControl/>
+              <w:suppressAutoHyphens w:val="true"/>
+              <w:spacing w:lineRule="auto" w:line="240" w:before="0" w:after="0"/>
+              <w:jc w:val="left"/>
+              <w:rPr>
+                <w:rFonts w:ascii="Aptos" w:hAnsi="Aptos" w:eastAsia="游ゴシック" w:cs=""/>
+                <w:kern w:val="2"/>
+                <w:sz w:val="22"/>
+                <w:szCs w:val="22"/>
+                <w:lang w:val="en-AU" w:eastAsia="ja-JP" w:bidi="ar-SA"/>
+              </w:rPr>
+            </w:pPr>
+            <w:r>
+              <w:rPr>
+                <w:rFonts w:eastAsia="游ゴシック" w:cs=""/>
+                <w:kern w:val="2"/>
+                <w:sz w:val="22"/>
+                <w:szCs w:val="22"/>
+                <w:lang w:val="en-AU" w:eastAsia="ja-JP" w:bidi="ar-SA"/>
+              </w:rPr>
+              <w:t>{{i.</w:t>
+            </w:r>
+            <w:r>
+              <w:rPr>
+                <w:rFonts w:eastAsia="游ゴシック" w:cs=""/>
+                <w:kern w:val="2"/>
+                <w:sz w:val="22"/>
+                <w:szCs w:val="22"/>
+                <w:lang w:val="en-AU" w:eastAsia="ja-JP" w:bidi="ar-SA"/>
+              </w:rPr>
+              <w:t>md5</w:t>
+            </w:r>
+            <w:r>
+              <w:rPr>
+                <w:rFonts w:eastAsia="游ゴシック" w:cs=""/>
+                <w:kern w:val="2"/>
+                <w:sz w:val="22"/>
+                <w:szCs w:val="22"/>
+                <w:lang w:val="en-AU" w:eastAsia="ja-JP" w:bidi="ar-SA"/>
+              </w:rPr>
+              <w:t xml:space="preserve"> }}</w:t>
             </w:r>
           </w:p>
         </w:tc>
@@ -3729,14 +4298,15 @@
         <w:trPr/>
         <w:tc>
           <w:tcPr>
-            <w:tcW w:w="9015" w:type="dxa"/>
-            <w:gridSpan w:val="2"/>
-            <w:tcBorders/>
-          </w:tcPr>
-          <w:p>
-            <w:pPr>
-              <w:pStyle w:val="Normal"/>
-              <w:widowControl/>
+            <w:tcW w:w="10639" w:type="dxa"/>
+            <w:gridSpan w:val="10"/>
+            <w:tcBorders/>
+          </w:tcPr>
+          <w:p>
+            <w:pPr>
+              <w:pStyle w:val="Normal"/>
+              <w:widowControl/>
+              <w:suppressAutoHyphens w:val="true"/>
               <w:spacing w:lineRule="auto" w:line="240" w:before="0" w:after="0"/>
               <w:jc w:val="left"/>
               <w:rPr>
@@ -3814,8 +4384,8 @@
       </w:tblPr>
       <w:tblGrid>
         <w:gridCol w:w="3014"/>
-        <w:gridCol w:w="3236"/>
-        <w:gridCol w:w="2766"/>
+        <w:gridCol w:w="3235"/>
+        <w:gridCol w:w="2767"/>
       </w:tblGrid>
       <w:tr>
         <w:trPr/>
@@ -3828,6 +4398,7 @@
             <w:pPr>
               <w:pStyle w:val="Normal"/>
               <w:widowControl/>
+              <w:suppressAutoHyphens w:val="true"/>
               <w:spacing w:lineRule="auto" w:line="240" w:before="0" w:after="0"/>
               <w:jc w:val="center"/>
               <w:rPr>
@@ -3851,13 +4422,14 @@
         </w:tc>
         <w:tc>
           <w:tcPr>
-            <w:tcW w:w="3236" w:type="dxa"/>
-            <w:tcBorders/>
-          </w:tcPr>
-          <w:p>
-            <w:pPr>
-              <w:pStyle w:val="Normal"/>
-              <w:widowControl/>
+            <w:tcW w:w="3235" w:type="dxa"/>
+            <w:tcBorders/>
+          </w:tcPr>
+          <w:p>
+            <w:pPr>
+              <w:pStyle w:val="Normal"/>
+              <w:widowControl/>
+              <w:suppressAutoHyphens w:val="true"/>
               <w:spacing w:lineRule="auto" w:line="240" w:before="0" w:after="0"/>
               <w:jc w:val="center"/>
               <w:rPr>
@@ -3881,13 +4453,14 @@
         </w:tc>
         <w:tc>
           <w:tcPr>
-            <w:tcW w:w="2766" w:type="dxa"/>
-            <w:tcBorders/>
-          </w:tcPr>
-          <w:p>
-            <w:pPr>
-              <w:pStyle w:val="Normal"/>
-              <w:widowControl/>
+            <w:tcW w:w="2767" w:type="dxa"/>
+            <w:tcBorders/>
+          </w:tcPr>
+          <w:p>
+            <w:pPr>
+              <w:pStyle w:val="Normal"/>
+              <w:widowControl/>
+              <w:suppressAutoHyphens w:val="true"/>
               <w:spacing w:lineRule="auto" w:line="240" w:before="0" w:after="0"/>
               <w:jc w:val="center"/>
               <w:rPr>
@@ -3914,7 +4487,7 @@
         <w:trPr/>
         <w:tc>
           <w:tcPr>
-            <w:tcW w:w="6250" w:type="dxa"/>
+            <w:tcW w:w="6249" w:type="dxa"/>
             <w:gridSpan w:val="2"/>
             <w:tcBorders/>
           </w:tcPr>
@@ -3922,6 +4495,7 @@
             <w:pPr>
               <w:pStyle w:val="Normal"/>
               <w:widowControl/>
+              <w:suppressAutoHyphens w:val="true"/>
               <w:spacing w:lineRule="auto" w:line="240" w:before="0" w:after="0"/>
               <w:jc w:val="left"/>
               <w:rPr>
@@ -3946,13 +4520,14 @@
         </w:tc>
         <w:tc>
           <w:tcPr>
-            <w:tcW w:w="2766" w:type="dxa"/>
-            <w:tcBorders/>
-          </w:tcPr>
-          <w:p>
-            <w:pPr>
-              <w:pStyle w:val="Normal"/>
-              <w:widowControl/>
+            <w:tcW w:w="2767" w:type="dxa"/>
+            <w:tcBorders/>
+          </w:tcPr>
+          <w:p>
+            <w:pPr>
+              <w:pStyle w:val="Normal"/>
+              <w:widowControl/>
+              <w:suppressAutoHyphens w:val="true"/>
               <w:spacing w:lineRule="auto" w:line="240" w:before="0" w:after="0"/>
               <w:jc w:val="left"/>
               <w:rPr>
@@ -3986,6 +4561,7 @@
             <w:pPr>
               <w:pStyle w:val="Normal"/>
               <w:widowControl/>
+              <w:suppressAutoHyphens w:val="true"/>
               <w:spacing w:lineRule="auto" w:line="240" w:before="0" w:after="0"/>
               <w:jc w:val="left"/>
               <w:rPr>
@@ -4010,13 +4586,14 @@
         </w:tc>
         <w:tc>
           <w:tcPr>
-            <w:tcW w:w="3236" w:type="dxa"/>
-            <w:tcBorders/>
-          </w:tcPr>
-          <w:p>
-            <w:pPr>
-              <w:pStyle w:val="Normal"/>
-              <w:widowControl/>
+            <w:tcW w:w="3235" w:type="dxa"/>
+            <w:tcBorders/>
+          </w:tcPr>
+          <w:p>
+            <w:pPr>
+              <w:pStyle w:val="Normal"/>
+              <w:widowControl/>
+              <w:suppressAutoHyphens w:val="true"/>
               <w:spacing w:lineRule="auto" w:line="240" w:before="0" w:after="0"/>
               <w:jc w:val="left"/>
               <w:rPr>
@@ -4041,13 +4618,14 @@
         </w:tc>
         <w:tc>
           <w:tcPr>
-            <w:tcW w:w="2766" w:type="dxa"/>
-            <w:tcBorders/>
-          </w:tcPr>
-          <w:p>
-            <w:pPr>
-              <w:pStyle w:val="Normal"/>
-              <w:widowControl/>
+            <w:tcW w:w="2767" w:type="dxa"/>
+            <w:tcBorders/>
+          </w:tcPr>
+          <w:p>
+            <w:pPr>
+              <w:pStyle w:val="Normal"/>
+              <w:widowControl/>
+              <w:suppressAutoHyphens w:val="true"/>
               <w:spacing w:lineRule="auto" w:line="240" w:before="0" w:after="0"/>
               <w:jc w:val="left"/>
               <w:rPr>
@@ -4075,7 +4653,7 @@
         <w:trPr/>
         <w:tc>
           <w:tcPr>
-            <w:tcW w:w="6250" w:type="dxa"/>
+            <w:tcW w:w="6249" w:type="dxa"/>
             <w:gridSpan w:val="2"/>
             <w:tcBorders/>
           </w:tcPr>
@@ -4083,6 +4661,7 @@
             <w:pPr>
               <w:pStyle w:val="Normal"/>
               <w:widowControl/>
+              <w:suppressAutoHyphens w:val="true"/>
               <w:spacing w:lineRule="auto" w:line="240" w:before="0" w:after="0"/>
               <w:jc w:val="left"/>
               <w:rPr>
@@ -4107,13 +4686,14 @@
         </w:tc>
         <w:tc>
           <w:tcPr>
-            <w:tcW w:w="2766" w:type="dxa"/>
-            <w:tcBorders/>
-          </w:tcPr>
-          <w:p>
-            <w:pPr>
-              <w:pStyle w:val="Normal"/>
-              <w:widowControl/>
+            <w:tcW w:w="2767" w:type="dxa"/>
+            <w:tcBorders/>
+          </w:tcPr>
+          <w:p>
+            <w:pPr>
+              <w:pStyle w:val="Normal"/>
+              <w:widowControl/>
+              <w:suppressAutoHyphens w:val="true"/>
               <w:spacing w:lineRule="auto" w:line="240" w:before="0" w:after="0"/>
               <w:jc w:val="left"/>
               <w:rPr>
@@ -4666,7 +5246,7 @@
   <w:docDefaults>
     <w:rPrDefault>
       <w:rPr>
-        <w:rFonts w:ascii="Aptos" w:hAnsi="Aptos" w:eastAsia="游ゴシック" w:cs="" w:asciiTheme="minorHAnsi" w:cstheme="minorBidi" w:eastAsiaTheme="minorEastAsia" w:hAnsiTheme="minorHAnsi"/>
+        <w:rFonts w:ascii="Aptos" w:hAnsi="Aptos" w:eastAsia="" w:cs="" w:asciiTheme="minorHAnsi" w:cstheme="minorBidi" w:eastAsiaTheme="minorEastAsia" w:hAnsiTheme="minorHAnsi"/>
         <w:kern w:val="2"/>
         <w:sz w:val="22"/>
         <w:szCs w:val="22"/>
@@ -5064,12 +5644,13 @@
     <w:rsid w:val="004a3a15"/>
     <w:pPr>
       <w:widowControl/>
+      <w:suppressAutoHyphens w:val="true"/>
       <w:bidi w:val="0"/>
       <w:spacing w:lineRule="auto" w:line="259" w:before="0" w:after="160"/>
       <w:jc w:val="left"/>
     </w:pPr>
     <w:rPr>
-      <w:rFonts w:ascii="Aptos" w:hAnsi="Aptos" w:eastAsia="游ゴシック" w:cs="" w:asciiTheme="minorHAnsi" w:cstheme="minorBidi" w:eastAsiaTheme="minorEastAsia" w:hAnsiTheme="minorHAnsi"/>
+      <w:rFonts w:ascii="Aptos" w:hAnsi="Aptos" w:eastAsia="" w:cs="" w:asciiTheme="minorHAnsi" w:cstheme="minorBidi" w:eastAsiaTheme="minorEastAsia" w:hAnsiTheme="minorHAnsi"/>
       <w:color w:val="auto"/>
       <w:kern w:val="2"/>
       <w:sz w:val="22"/>
@@ -5112,7 +5693,7 @@
       <w:outlineLvl w:val="1"/>
     </w:pPr>
     <w:rPr>
-      <w:rFonts w:ascii="Aptos Display" w:hAnsi="Aptos Display" w:eastAsia="游ゴシック Light" w:cs="" w:asciiTheme="majorHAnsi" w:cstheme="majorBidi" w:eastAsiaTheme="majorEastAsia" w:hAnsiTheme="majorHAnsi"/>
+      <w:rFonts w:ascii="Aptos Display" w:hAnsi="Aptos Display" w:eastAsia="" w:cs="" w:asciiTheme="majorHAnsi" w:cstheme="majorBidi" w:eastAsiaTheme="majorEastAsia" w:hAnsiTheme="majorHAnsi"/>
       <w:color w:themeColor="accent1" w:themeShade="bf" w:val="0F4761"/>
       <w:sz w:val="32"/>
       <w:szCs w:val="32"/>
@@ -5135,7 +5716,7 @@
       <w:outlineLvl w:val="2"/>
     </w:pPr>
     <w:rPr>
-      <w:rFonts w:eastAsia="游ゴシック Light" w:cs="" w:cstheme="majorBidi" w:eastAsiaTheme="majorEastAsia"/>
+      <w:rFonts w:eastAsia="" w:cs="" w:cstheme="majorBidi" w:eastAsiaTheme="majorEastAsia"/>
       <w:color w:themeColor="accent1" w:themeShade="bf" w:val="0F4761"/>
       <w:sz w:val="28"/>
       <w:szCs w:val="28"/>
@@ -5158,7 +5739,7 @@
       <w:outlineLvl w:val="3"/>
     </w:pPr>
     <w:rPr>
-      <w:rFonts w:eastAsia="游ゴシック Light" w:cs="" w:cstheme="majorBidi" w:eastAsiaTheme="majorEastAsia"/>
+      <w:rFonts w:eastAsia="" w:cs="" w:cstheme="majorBidi" w:eastAsiaTheme="majorEastAsia"/>
       <w:i/>
       <w:iCs/>
       <w:color w:themeColor="accent1" w:themeShade="bf" w:val="0F4761"/>
@@ -5181,7 +5762,7 @@
       <w:outlineLvl w:val="4"/>
     </w:pPr>
     <w:rPr>
-      <w:rFonts w:eastAsia="游ゴシック Light" w:cs="" w:cstheme="majorBidi" w:eastAsiaTheme="majorEastAsia"/>
+      <w:rFonts w:eastAsia="" w:cs="" w:cstheme="majorBidi" w:eastAsiaTheme="majorEastAsia"/>
       <w:color w:themeColor="accent1" w:themeShade="bf" w:val="0F4761"/>
     </w:rPr>
   </w:style>
@@ -5202,7 +5783,7 @@
       <w:outlineLvl w:val="5"/>
     </w:pPr>
     <w:rPr>
-      <w:rFonts w:eastAsia="游ゴシック Light" w:cs="" w:cstheme="majorBidi" w:eastAsiaTheme="majorEastAsia"/>
+      <w:rFonts w:eastAsia="" w:cs="" w:cstheme="majorBidi" w:eastAsiaTheme="majorEastAsia"/>
       <w:i/>
       <w:iCs/>
       <w:color w:themeColor="text1" w:themeTint="a6" w:val="595959"/>
@@ -5225,7 +5806,7 @@
       <w:outlineLvl w:val="6"/>
     </w:pPr>
     <w:rPr>
-      <w:rFonts w:eastAsia="游ゴシック Light" w:cs="" w:cstheme="majorBidi" w:eastAsiaTheme="majorEastAsia"/>
+      <w:rFonts w:eastAsia="" w:cs="" w:cstheme="majorBidi" w:eastAsiaTheme="majorEastAsia"/>
       <w:color w:themeColor="text1" w:themeTint="a6" w:val="595959"/>
     </w:rPr>
   </w:style>
@@ -5246,7 +5827,7 @@
       <w:outlineLvl w:val="7"/>
     </w:pPr>
     <w:rPr>
-      <w:rFonts w:eastAsia="游ゴシック Light" w:cs="" w:cstheme="majorBidi" w:eastAsiaTheme="majorEastAsia"/>
+      <w:rFonts w:eastAsia="" w:cs="" w:cstheme="majorBidi" w:eastAsiaTheme="majorEastAsia"/>
       <w:i/>
       <w:iCs/>
       <w:color w:themeColor="text1" w:themeTint="d8" w:val="272727"/>
@@ -5269,7 +5850,7 @@
       <w:outlineLvl w:val="8"/>
     </w:pPr>
     <w:rPr>
-      <w:rFonts w:eastAsia="游ゴシック Light" w:cs="" w:cstheme="majorBidi" w:eastAsiaTheme="majorEastAsia"/>
+      <w:rFonts w:eastAsia="" w:cs="" w:cstheme="majorBidi" w:eastAsiaTheme="majorEastAsia"/>
       <w:color w:themeColor="text1" w:themeTint="d8" w:val="272727"/>
     </w:rPr>
   </w:style>
@@ -5304,7 +5885,7 @@
     <w:qFormat/>
     <w:rsid w:val="00200641"/>
     <w:rPr>
-      <w:rFonts w:ascii="Aptos Display" w:hAnsi="Aptos Display" w:eastAsia="游ゴシック Light" w:cs="" w:asciiTheme="majorHAnsi" w:cstheme="majorBidi" w:eastAsiaTheme="majorEastAsia" w:hAnsiTheme="majorHAnsi"/>
+      <w:rFonts w:ascii="Aptos Display" w:hAnsi="Aptos Display" w:eastAsia="" w:cs="" w:asciiTheme="majorHAnsi" w:cstheme="majorBidi" w:eastAsiaTheme="majorEastAsia" w:hAnsiTheme="majorHAnsi"/>
       <w:color w:themeColor="accent1" w:themeShade="bf" w:val="0F4761"/>
       <w:sz w:val="32"/>
       <w:szCs w:val="32"/>
@@ -5319,7 +5900,7 @@
     <w:qFormat/>
     <w:rsid w:val="00200641"/>
     <w:rPr>
-      <w:rFonts w:eastAsia="游ゴシック Light" w:cs="" w:cstheme="majorBidi" w:eastAsiaTheme="majorEastAsia"/>
+      <w:rFonts w:eastAsia="" w:cs="" w:cstheme="majorBidi" w:eastAsiaTheme="majorEastAsia"/>
       <w:color w:themeColor="accent1" w:themeShade="bf" w:val="0F4761"/>
       <w:sz w:val="28"/>
       <w:szCs w:val="28"/>
@@ -5334,7 +5915,7 @@
     <w:qFormat/>
     <w:rsid w:val="00200641"/>
     <w:rPr>
-      <w:rFonts w:eastAsia="游ゴシック Light" w:cs="" w:cstheme="majorBidi" w:eastAsiaTheme="majorEastAsia"/>
+      <w:rFonts w:eastAsia="" w:cs="" w:cstheme="majorBidi" w:eastAsiaTheme="majorEastAsia"/>
       <w:i/>
       <w:iCs/>
       <w:color w:themeColor="accent1" w:themeShade="bf" w:val="0F4761"/>
@@ -5349,7 +5930,7 @@
     <w:qFormat/>
     <w:rsid w:val="00200641"/>
     <w:rPr>
-      <w:rFonts w:eastAsia="游ゴシック Light" w:cs="" w:cstheme="majorBidi" w:eastAsiaTheme="majorEastAsia"/>
+      <w:rFonts w:eastAsia="" w:cs="" w:cstheme="majorBidi" w:eastAsiaTheme="majorEastAsia"/>
       <w:color w:themeColor="accent1" w:themeShade="bf" w:val="0F4761"/>
     </w:rPr>
   </w:style>
@@ -5362,7 +5943,7 @@
     <w:qFormat/>
     <w:rsid w:val="00200641"/>
     <w:rPr>
-      <w:rFonts w:eastAsia="游ゴシック Light" w:cs="" w:cstheme="majorBidi" w:eastAsiaTheme="majorEastAsia"/>
+      <w:rFonts w:eastAsia="" w:cs="" w:cstheme="majorBidi" w:eastAsiaTheme="majorEastAsia"/>
       <w:i/>
       <w:iCs/>
       <w:color w:themeColor="text1" w:themeTint="a6" w:val="595959"/>
@@ -5377,7 +5958,7 @@
     <w:qFormat/>
     <w:rsid w:val="00200641"/>
     <w:rPr>
-      <w:rFonts w:eastAsia="游ゴシック Light" w:cs="" w:cstheme="majorBidi" w:eastAsiaTheme="majorEastAsia"/>
+      <w:rFonts w:eastAsia="" w:cs="" w:cstheme="majorBidi" w:eastAsiaTheme="majorEastAsia"/>
       <w:color w:themeColor="text1" w:themeTint="a6" w:val="595959"/>
     </w:rPr>
   </w:style>
@@ -5390,7 +5971,7 @@
     <w:qFormat/>
     <w:rsid w:val="00200641"/>
     <w:rPr>
-      <w:rFonts w:eastAsia="游ゴシック Light" w:cs="" w:cstheme="majorBidi" w:eastAsiaTheme="majorEastAsia"/>
+      <w:rFonts w:eastAsia="" w:cs="" w:cstheme="majorBidi" w:eastAsiaTheme="majorEastAsia"/>
       <w:i/>
       <w:iCs/>
       <w:color w:themeColor="text1" w:themeTint="d8" w:val="272727"/>
@@ -5405,7 +5986,7 @@
     <w:qFormat/>
     <w:rsid w:val="00200641"/>
     <w:rPr>
-      <w:rFonts w:eastAsia="游ゴシック Light" w:cs="" w:cstheme="majorBidi" w:eastAsiaTheme="majorEastAsia"/>
+      <w:rFonts w:eastAsia="" w:cs="" w:cstheme="majorBidi" w:eastAsiaTheme="majorEastAsia"/>
       <w:color w:themeColor="text1" w:themeTint="d8" w:val="272727"/>
     </w:rPr>
   </w:style>
@@ -5417,7 +5998,7 @@
     <w:qFormat/>
     <w:rsid w:val="00200641"/>
     <w:rPr>
-      <w:rFonts w:ascii="Aptos Display" w:hAnsi="Aptos Display" w:eastAsia="游ゴシック Light" w:cs="" w:asciiTheme="majorHAnsi" w:cstheme="majorBidi" w:eastAsiaTheme="majorEastAsia" w:hAnsiTheme="majorHAnsi"/>
+      <w:rFonts w:ascii="Aptos Display" w:hAnsi="Aptos Display" w:eastAsia="" w:cs="" w:asciiTheme="majorHAnsi" w:cstheme="majorBidi" w:eastAsiaTheme="majorEastAsia" w:hAnsiTheme="majorHAnsi"/>
       <w:spacing w:val="-10"/>
       <w:kern w:val="2"/>
       <w:sz w:val="56"/>
@@ -5432,7 +6013,7 @@
     <w:qFormat/>
     <w:rsid w:val="00200641"/>
     <w:rPr>
-      <w:rFonts w:eastAsia="游ゴシック Light" w:cs="" w:cstheme="majorBidi" w:eastAsiaTheme="majorEastAsia"/>
+      <w:rFonts w:eastAsia="" w:cs="" w:cstheme="majorBidi" w:eastAsiaTheme="majorEastAsia"/>
       <w:color w:themeColor="text1" w:themeTint="a6" w:val="595959"/>
       <w:spacing w:val="15"/>
       <w:sz w:val="28"/>
@@ -5609,7 +6190,7 @@
       <w:contextualSpacing/>
     </w:pPr>
     <w:rPr>
-      <w:rFonts w:ascii="Aptos Display" w:hAnsi="Aptos Display" w:eastAsia="游ゴシック Light" w:cs="" w:asciiTheme="majorHAnsi" w:cstheme="majorBidi" w:eastAsiaTheme="majorEastAsia" w:hAnsiTheme="majorHAnsi"/>
+      <w:rFonts w:ascii="Aptos Display" w:hAnsi="Aptos Display" w:eastAsia="" w:cs="" w:asciiTheme="majorHAnsi" w:cstheme="majorBidi" w:eastAsiaTheme="majorEastAsia" w:hAnsiTheme="majorHAnsi"/>
       <w:spacing w:val="-10"/>
       <w:kern w:val="2"/>
       <w:sz w:val="56"/>
@@ -5626,7 +6207,7 @@
     <w:rsid w:val="00200641"/>
     <w:pPr/>
     <w:rPr>
-      <w:rFonts w:eastAsia="游ゴシック Light" w:cs="" w:cstheme="majorBidi" w:eastAsiaTheme="majorEastAsia"/>
+      <w:rFonts w:eastAsia="" w:cs="" w:cstheme="majorBidi" w:eastAsiaTheme="majorEastAsia"/>
       <w:color w:themeColor="text1" w:themeTint="a6" w:val="595959"/>
       <w:spacing w:val="15"/>
       <w:sz w:val="28"/>
@@ -5782,6 +6363,29 @@
       <w:spacing w:before="0" w:after="100"/>
     </w:pPr>
     <w:rPr/>
+  </w:style>
+  <w:style w:type="paragraph" w:styleId="TableContents">
+    <w:name w:val="Table Contents"/>
+    <w:basedOn w:val="Normal"/>
+    <w:qFormat/>
+    <w:pPr>
+      <w:widowControl w:val="false"/>
+      <w:suppressLineNumbers/>
+    </w:pPr>
+    <w:rPr/>
+  </w:style>
+  <w:style w:type="paragraph" w:styleId="TableHeading">
+    <w:name w:val="Table Heading"/>
+    <w:basedOn w:val="TableContents"/>
+    <w:qFormat/>
+    <w:pPr>
+      <w:suppressLineNumbers/>
+      <w:jc w:val="center"/>
+    </w:pPr>
+    <w:rPr>
+      <w:b/>
+      <w:bCs/>
+    </w:rPr>
   </w:style>
   <w:style w:type="numbering" w:styleId="NoList" w:default="1">
     <w:name w:val="No List"/>

</xml_diff>